<commit_message>
chore: remove obsolete GitHub Actions workflow (Ollama eliminated)
</commit_message>
<xml_diff>
--- a/Elenco_skill.docx
+++ b/Elenco_skill.docx
@@ -18,6 +18,60 @@
         <w:t>Elenco in ordine alfabetico delle skill personalizzate create nel workspace, con una descrizione di cosa fa ciascuna e quando usarla. Si aggiorna automaticamente ogni volta che ne creiamo una nuova, senza bisogno di chiederlo.</w:t>
       </w:r>
     </w:p>
+    <w:p>
+      <w:r>
+        <w:rPr>
+          <w:b/>
+          <w:sz w:val="26"/>
+        </w:rPr>
+        <w:t>/aggiorna-contesto</w:t>
+      </w:r>
+    </w:p>
+    <w:p>
+      <w:r>
+        <w:rPr>
+          <w:b/>
+        </w:rPr>
+        <w:t xml:space="preserve">A cosa serve: </w:t>
+      </w:r>
+      <w:r>
+        <w:t>Raccogliere tramite domande una nuova informazione, regola o preferenza stabile e aggiornare di conseguenza CLAUDE.md o i file in context/ (o i loro equivalenti locali), solo dopo tua approvazione esplicita.</w:t>
+      </w:r>
+    </w:p>
+    <w:p>
+      <w:r>
+        <w:rPr>
+          <w:b/>
+        </w:rPr>
+        <w:t xml:space="preserve">Come si usa: </w:t>
+      </w:r>
+      <w:r>
+        <w:t>Scrivi /aggiorna-contesto seguito (facoltativo) da cosa vuoi far ricordare, oppure lancia la skill da sola e rispondi alle domande che ti farà.</w:t>
+      </w:r>
+    </w:p>
+    <w:p>
+      <w:r>
+        <w:rPr>
+          <w:b/>
+        </w:rPr>
+        <w:t xml:space="preserve">Cosa fa nel dettaglio: </w:t>
+      </w:r>
+      <w:r>
+        <w:t>Fa solo le domande necessarie, una alla volta, per capire se l'informazione è stabile o solo per la richiesta corrente, se è generale o specifica di un'area, e se confligge con qualcosa già scritto. Determina da sola il file di destinazione giusto seguendo la struttura già definita in CLAUDE.md (context/ universale, contesti specialistici, CLAUDE.md locali, dossier riservato, ecc.). Prima di scrivere qualunque cosa, mostra sempre un piano completo con file, testo esatto della modifica, motivo della scelta ed eventuali sovrapposizioni con contenuti esistenti, e aspetta la tua approvazione.</w:t>
+      </w:r>
+    </w:p>
+    <w:p>
+      <w:r>
+        <w:rPr>
+          <w:b/>
+        </w:rPr>
+        <w:t xml:space="preserve">Cosa non fa: </w:t>
+      </w:r>
+      <w:r>
+        <w:t>Non modifica mai nulla senza piano approvato: se non approvi, non cambia niente. Non crea file di test o bozze. Non duplica un'informazione già presente altrove senza motivo, e non tocca il dossier riservato per informazioni che non riguardano una valutazione professionale specifica.</w:t>
+      </w:r>
+    </w:p>
+    <w:p/>
     <w:p>
       <w:pPr>
         <w:spacing w:before="120" w:after="80"/>
@@ -347,6 +401,64 @@
       <w:pPr>
         <w:spacing w:after="80"/>
       </w:pPr>
+    </w:p>
+    <w:p>
+      <w:r>
+        <w:rPr>
+          <w:b/>
+          <w:sz w:val="26"/>
+        </w:rPr>
+        <w:t>/sintesi-allegato</w:t>
+      </w:r>
+    </w:p>
+    <w:p>
+      <w:r>
+        <w:rPr>
+          <w:b/>
+        </w:rPr>
+        <w:t xml:space="preserve">A cosa serve: </w:t>
+      </w:r>
+      <w:r/>
+      <w:r>
+        <w:t>Leggere un file Word/PDF oppure il link di una pagina web (articolo, newsletter, blog) e produrne una sintesi chiara, salvata come nuovo documento Word.</w:t>
+      </w:r>
+    </w:p>
+    <w:p>
+      <w:r>
+        <w:rPr>
+          <w:b/>
+        </w:rPr>
+        <w:t xml:space="preserve">Come si usa: </w:t>
+      </w:r>
+      <w:r/>
+      <w:r>
+        <w:t>Scrivi /sintesi-allegato indicando il file o incollando il link della pagina da sintetizzare (o lascia dedurre il file se è l'unico presente in Email/Allegati-da-analizzare).</w:t>
+      </w:r>
+    </w:p>
+    <w:p>
+      <w:r>
+        <w:rPr>
+          <w:b/>
+        </w:rPr>
+        <w:t xml:space="preserve">Cosa fa nel dettaglio: </w:t>
+      </w:r>
+      <w:r/>
+      <w:r/>
+      <w:r>
+        <w:t>Legge la fonte integralmente — file locale (anche PDF scansionati, pagina per pagina) o link web (contenuto reale della pagina, non solo l'anteprima) — e scrive una sintesi fedele al contenuto: di cosa tratta, punti principali, dati e fatti rilevanti, autore/testata se è un articolo. Se il documento contiene già conclusioni o raccomandazioni dell'autore le riporta come tali. Segnala esplicitamente parti illeggibili, mancanti o dietro paywall/login invece di ometterle. Chiude sempre con una sezione «Take away principali» (3-6 punti da memorizzare). Solo per il bollettino «Job in Tourism» (riconoscibile dal nome, circa settimanale), indica sempre se ci sono posizioni da Direttore d'albergo o General Manager — elencandole se ci sono, dichiarando esplicitamente la loro assenza se non ci sono — subito prima dei take away; per nessun altro documento. Salva il risultato con la data nel nome: accanto al file originale se la fonte è locale, in Email/Allegati-da-analizzare/ se la fonte è un link web.</w:t>
+      </w:r>
+    </w:p>
+    <w:p>
+      <w:r>
+        <w:rPr>
+          <w:b/>
+        </w:rPr>
+        <w:t xml:space="preserve">Cosa non fa: </w:t>
+      </w:r>
+      <w:r/>
+      <w:r>
+        <w:t>Non aggiunge opinioni, raccomandazioni o confronti: è solo una sintesi, non un'analisi. Non menziona l'argomento Direttore/GM per nessun documento diverso da «Job in Tourism» (né in un senso né nell'altro). Non sostituisce /email quando serve gestire un'intera pratica (storia della conversazione, bozza di risposta): lì l'obiettivo è più ampio.</w:t>
+      </w:r>
     </w:p>
     <w:sectPr>
       <w:pgSz w:w="12240" w:h="15840"/>

</xml_diff>